<commit_message>
Finalize CardioSense AI: 7-model comparison, responsive UI, updated report/slides, viva Q&A
- Remove MLP; app, training script, CSV, README, report and slides now describe 7 models
- Responsive Streamlit layout; Threshold tab explains the illustrative 0.4/0.6 bands
- README, report: state browser-emulation-only testing, not deployed, no physical-device test
- Rebuild report DOCX/PDF and slides; add emulated phone/tablet/desktop screenshots
- Add VIVA_QA.md

Co-Authored-By: Claude Sonnet 5.5 <noreply@anthropic.com>
</commit_message>
<xml_diff>
--- a/CardioSense_AI_Report.docx
+++ b/CardioSense_AI_Report.docx
@@ -108,7 +108,7 @@
         <w:jc w:val="both"/>
       </w:pPr>
       <w:r>
-        <w:t>This report builds and compares eight machine learning models that predict cardiovascular disease from eleven routine health measurements in the 70,000-record Kaggle Cardiovascular Disease dataset. Cleaning removed 1,477 impossible records, and the remaining 68,523 were split 70/15/15 with stratification. Gradient Boosting, selected on validation ROC-AUC, reaches 73.7% test accuracy and a ROC-AUC of 0.802; the top four models differ by less than 0.7 points, and systolic blood pressure is the dominant feature. The best model is deployed as a Streamlit web app that runs locally in any browser.</w:t>
+        <w:t>This report builds and compares seven machine learning models that predict cardiovascular disease from eleven routine health measurements in the 70,000-record Kaggle Cardiovascular Disease dataset. Cleaning removed 1,477 duplicate or impossible records, and the remaining 68,523 were split 70/15/15 with stratification. Gradient Boosting, selected on validation ROC-AUC, reaches 73.7% test accuracy and a ROC-AUC of 0.802; the top three models differ by less than 0.3 points, and systolic blood pressure is the dominant feature. The best model is served through a responsive Streamlit web app (phone, tablet and desktop layouts) that runs locally and is not deployed publicly.</w:t>
       </w:r>
     </w:p>
     <w:p>
@@ -975,7 +975,7 @@
         <w:jc w:val="both"/>
       </w:pPr>
       <w:r>
-        <w:t>Compare eight classification models on the same split using accuracy, precision, recall, F1 and ROC-AUC.</w:t>
+        <w:t>Compare seven classification models on the same split using accuracy, precision, recall, F1 and ROC-AUC.</w:t>
       </w:r>
     </w:p>
     <w:p>
@@ -1003,7 +1003,7 @@
         <w:jc w:val="both"/>
       </w:pPr>
       <w:r>
-        <w:t>Deploy the best model as a web app that runs on phones and laptops.</w:t>
+        <w:t>Serve the best model through a responsive Streamlit web app whose layout adapts to phone, tablet and desktop screens.</w:t>
       </w:r>
     </w:p>
     <w:p>
@@ -2368,7 +2368,7 @@
         <w:jc w:val="both"/>
       </w:pPr>
       <w:r>
-        <w:t>Most reviewed studies report one best model or use small datasets. This project compares eight models on one clean, stratified split of a large public dataset, selects the winner on a validation set, reports the untouched test result and ships the winner as a working web app.</w:t>
+        <w:t>Most reviewed studies report one best model or use small datasets. This project compares seven models on one clean, stratified split of a large public dataset, selects the winner on a validation set, reports the untouched test result and ships the winner as a working web app.</w:t>
       </w:r>
     </w:p>
     <w:p>
@@ -2518,7 +2518,7 @@
         <w:jc w:val="both"/>
       </w:pPr>
       <w:r>
-        <w:t>Eight models cover linear, distance-based, tree-based, margin-based (SVM), boosted and neural approaches. Scale-sensitive models (Logistic Regression, KNN, SVM, MLP) use a StandardScaler pipeline fitted on training data only. The Decision Tree uses criterion = entropy (information gain, the idea behind ID3); scikit-learn builds CART-style trees, so it is not an exact ID3 implementation. The SVM has no probability calibration, so its ROC-AUC uses decision_function scores and it cannot be the deployed model.</w:t>
+        <w:t>Seven models cover linear, distance-based, tree-based, margin-based (SVM) and boosted approaches. Scale-sensitive models (Logistic Regression, KNN, SVM) use a StandardScaler pipeline fitted on training data only. The Decision Tree uses criterion = entropy (information gain, the idea behind ID3); scikit-learn builds CART-style trees, so it is not an exact ID3 implementation. The SVM has no probability calibration, so its ROC-AUC uses decision_function scores and it cannot be the deployed model.</w:t>
       </w:r>
     </w:p>
     <w:p>
@@ -3319,92 +3319,6 @@
                 <w:szCs w:val="18"/>
               </w:rPr>
               <w:t>300 iterations, learning rate 0.06</w:t>
-            </w:r>
-          </w:p>
-        </w:tc>
-      </w:tr>
-      <w:tr>
-        <w:trPr>
-          <w:cantSplit/>
-        </w:trPr>
-        <w:tc>
-          <w:tcPr>
-            <w:tcW w:w="2301" w:type="dxa"/>
-            <w:tcBorders>
-              <w:top w:val="single" w:sz="4" w:space="0" w:color="000000"/>
-              <w:left w:val="single" w:sz="4" w:space="0" w:color="000000"/>
-              <w:bottom w:val="single" w:sz="4" w:space="0" w:color="000000"/>
-              <w:right w:val="single" w:sz="4" w:space="0" w:color="000000"/>
-            </w:tcBorders>
-            <w:tcMar>
-              <w:top w:w="40" w:type="dxa"/>
-              <w:left w:w="70" w:type="dxa"/>
-              <w:bottom w:w="40" w:type="dxa"/>
-              <w:right w:w="70" w:type="dxa"/>
-            </w:tcMar>
-            <w:vAlign w:val="center"/>
-          </w:tcPr>
-          <w:p>
-            <w:r>
-              <w:rPr>
-                <w:sz w:val="18"/>
-                <w:szCs w:val="18"/>
-              </w:rPr>
-              <w:t>Neural Network (MLP)</w:t>
-            </w:r>
-          </w:p>
-        </w:tc>
-        <w:tc>
-          <w:tcPr>
-            <w:tcW w:w="2301" w:type="dxa"/>
-            <w:tcBorders>
-              <w:top w:val="single" w:sz="4" w:space="0" w:color="000000"/>
-              <w:left w:val="single" w:sz="4" w:space="0" w:color="000000"/>
-              <w:bottom w:val="single" w:sz="4" w:space="0" w:color="000000"/>
-              <w:right w:val="single" w:sz="4" w:space="0" w:color="000000"/>
-            </w:tcBorders>
-            <w:tcMar>
-              <w:top w:w="40" w:type="dxa"/>
-              <w:left w:w="70" w:type="dxa"/>
-              <w:bottom w:w="40" w:type="dxa"/>
-              <w:right w:w="70" w:type="dxa"/>
-            </w:tcMar>
-            <w:vAlign w:val="center"/>
-          </w:tcPr>
-          <w:p>
-            <w:r>
-              <w:rPr>
-                <w:sz w:val="18"/>
-                <w:szCs w:val="18"/>
-              </w:rPr>
-              <w:t>Neural network</w:t>
-            </w:r>
-          </w:p>
-        </w:tc>
-        <w:tc>
-          <w:tcPr>
-            <w:tcW w:w="4703" w:type="dxa"/>
-            <w:tcBorders>
-              <w:top w:val="single" w:sz="4" w:space="0" w:color="000000"/>
-              <w:left w:val="single" w:sz="4" w:space="0" w:color="000000"/>
-              <w:bottom w:val="single" w:sz="4" w:space="0" w:color="000000"/>
-              <w:right w:val="single" w:sz="4" w:space="0" w:color="000000"/>
-            </w:tcBorders>
-            <w:tcMar>
-              <w:top w:w="40" w:type="dxa"/>
-              <w:left w:w="70" w:type="dxa"/>
-              <w:bottom w:w="40" w:type="dxa"/>
-              <w:right w:w="70" w:type="dxa"/>
-            </w:tcMar>
-            <w:vAlign w:val="center"/>
-          </w:tcPr>
-          <w:p>
-            <w:r>
-              <w:rPr>
-                <w:sz w:val="18"/>
-                <w:szCs w:val="18"/>
-              </w:rPr>
-              <w:t>Two hidden layers (64, 32), early stopping, standardised inputs</w:t>
             </w:r>
           </w:p>
         </w:tc>
@@ -8708,7 +8622,7 @@
         <w:jc w:val="both"/>
       </w:pPr>
       <w:r>
-        <w:t>Eight models were compared on a cleaned, stratified split of 68,523 records. Gradient Boosting, selected on validation ROC-AUC, reaches 73.7% test accuracy and a ROC-AUC of 0.802. The differences among the top four models are within the margin of error of the test set, so the choice of features and decision cutoff matters more than the choice of model. Blood pressure, age and cholesterol drive the predictions, and the model is deployed as a web app. Future work:</w:t>
+        <w:t>Seven models were compared on a cleaned, stratified split of 68,523 records. Gradient Boosting, selected on validation ROC-AUC, reaches 73.7% test accuracy and a ROC-AUC of 0.802. The differences among the top three models are within the margin of error of the test set, so the choice of features and decision cutoff matters more than the choice of model. Blood pressure, age and cholesterol drive the predictions, and the model is served through a responsive web app that runs locally. Future work:</w:t>
       </w:r>
     </w:p>
     <w:p>
@@ -8750,7 +8664,7 @@
         <w:jc w:val="both"/>
       </w:pPr>
       <w:r>
-        <w:t>add SHAP explanations to the app and validate the model on an external dataset.</w:t>
+        <w:t>add SHAP explanations to the app, validate on an external dataset, and test on physical phones and tablets before any public deployment.</w:t>
       </w:r>
     </w:p>
     <w:p>
@@ -8768,7 +8682,7 @@
         <w:jc w:val="both"/>
       </w:pPr>
       <w:r>
-        <w:t>Eight models were trained on the same training set and scored on the same untouched test set. The four ensemble and neural models finish within 0.003 ROC-AUC of each other, and even the simplest model, Logistic Regression, is only about 1 point of accuracy behind the best. Rows in Table 10 are ordered by validation ROC-AUC, the criterion used to pick the final model among models that output probabilities; Figures 6 and 7 show the same comparison graphically.</w:t>
+        <w:t>Seven models were trained on the same training set and scored on the same untouched test set. The three ensemble models (Gradient Boosting, Random Forest and HistGradientBoosting) finish within 0.001 ROC-AUC of each other, and even the simplest model, Logistic Regression, is only about 1 point of accuracy behind the best. Rows in Table 10 are ordered by validation ROC-AUC, the criterion used to pick the final model among models that output probabilities; Figures 6 and 7 show the same comparison graphically. Here “state-of-the-art” means a comparison of standard, widely used scikit-learn model families; no claim of novelty or of being the best possible model is made.</w:t>
       </w:r>
     </w:p>
     <w:p>
@@ -8782,7 +8696,7 @@
           <w:sz w:val="20"/>
           <w:szCs w:val="20"/>
         </w:rPr>
-        <w:t>Table 10. Validation and test performance of all eight models (test set: 10,279 patients; selected model first). Training times depend on the computer; the SVM took about 138 s.</w:t>
+        <w:t>Table 10. Validation and test performance of all seven models (test set: 10,279 patients; selected model first). Training times depend on the computer; the SVM took about 138 s.</w:t>
       </w:r>
     </w:p>
     <w:tbl>
@@ -9859,260 +9773,6 @@
                 <w:szCs w:val="17"/>
               </w:rPr>
               <w:t>0.4</w:t>
-            </w:r>
-          </w:p>
-        </w:tc>
-      </w:tr>
-      <w:tr>
-        <w:trPr>
-          <w:cantSplit/>
-        </w:trPr>
-        <w:tc>
-          <w:tcPr>
-            <w:tcW w:w="2301" w:type="dxa"/>
-            <w:tcBorders>
-              <w:top w:val="single" w:sz="4" w:space="0" w:color="000000"/>
-              <w:left w:val="single" w:sz="4" w:space="0" w:color="000000"/>
-              <w:bottom w:val="single" w:sz="4" w:space="0" w:color="000000"/>
-              <w:right w:val="single" w:sz="4" w:space="0" w:color="000000"/>
-            </w:tcBorders>
-            <w:tcMar>
-              <w:top w:w="40" w:type="dxa"/>
-              <w:left w:w="70" w:type="dxa"/>
-              <w:bottom w:w="40" w:type="dxa"/>
-              <w:right w:w="70" w:type="dxa"/>
-            </w:tcMar>
-            <w:vAlign w:val="center"/>
-          </w:tcPr>
-          <w:p>
-            <w:pPr>
-              <w:keepNext/>
-            </w:pPr>
-            <w:r>
-              <w:rPr>
-                <w:sz w:val="17"/>
-                <w:szCs w:val="17"/>
-              </w:rPr>
-              <w:t>Neural Network (MLP)</w:t>
-            </w:r>
-          </w:p>
-        </w:tc>
-        <w:tc>
-          <w:tcPr>
-            <w:tcW w:w="951" w:type="dxa"/>
-            <w:tcBorders>
-              <w:top w:val="single" w:sz="4" w:space="0" w:color="000000"/>
-              <w:left w:val="single" w:sz="4" w:space="0" w:color="000000"/>
-              <w:bottom w:val="single" w:sz="4" w:space="0" w:color="000000"/>
-              <w:right w:val="single" w:sz="4" w:space="0" w:color="000000"/>
-            </w:tcBorders>
-            <w:tcMar>
-              <w:top w:w="40" w:type="dxa"/>
-              <w:left w:w="70" w:type="dxa"/>
-              <w:bottom w:w="40" w:type="dxa"/>
-              <w:right w:w="70" w:type="dxa"/>
-            </w:tcMar>
-            <w:vAlign w:val="center"/>
-          </w:tcPr>
-          <w:p>
-            <w:pPr>
-              <w:keepNext/>
-              <w:jc w:val="center"/>
-            </w:pPr>
-            <w:r>
-              <w:rPr>
-                <w:sz w:val="17"/>
-                <w:szCs w:val="17"/>
-              </w:rPr>
-              <w:t>0.7993</w:t>
-            </w:r>
-          </w:p>
-        </w:tc>
-        <w:tc>
-          <w:tcPr>
-            <w:tcW w:w="1001" w:type="dxa"/>
-            <w:tcBorders>
-              <w:top w:val="single" w:sz="4" w:space="0" w:color="000000"/>
-              <w:left w:val="single" w:sz="4" w:space="0" w:color="000000"/>
-              <w:bottom w:val="single" w:sz="4" w:space="0" w:color="000000"/>
-              <w:right w:val="single" w:sz="4" w:space="0" w:color="000000"/>
-            </w:tcBorders>
-            <w:tcMar>
-              <w:top w:w="40" w:type="dxa"/>
-              <w:left w:w="70" w:type="dxa"/>
-              <w:bottom w:w="40" w:type="dxa"/>
-              <w:right w:w="70" w:type="dxa"/>
-            </w:tcMar>
-            <w:vAlign w:val="center"/>
-          </w:tcPr>
-          <w:p>
-            <w:pPr>
-              <w:keepNext/>
-              <w:jc w:val="center"/>
-            </w:pPr>
-            <w:r>
-              <w:rPr>
-                <w:sz w:val="17"/>
-                <w:szCs w:val="17"/>
-              </w:rPr>
-              <w:t>0.7313</w:t>
-            </w:r>
-          </w:p>
-        </w:tc>
-        <w:tc>
-          <w:tcPr>
-            <w:tcW w:w="1001" w:type="dxa"/>
-            <w:gridSpan w:val="2"/>
-            <w:tcBorders>
-              <w:top w:val="single" w:sz="4" w:space="0" w:color="000000"/>
-              <w:left w:val="single" w:sz="4" w:space="0" w:color="000000"/>
-              <w:bottom w:val="single" w:sz="4" w:space="0" w:color="000000"/>
-              <w:right w:val="single" w:sz="4" w:space="0" w:color="000000"/>
-            </w:tcBorders>
-            <w:tcMar>
-              <w:top w:w="40" w:type="dxa"/>
-              <w:left w:w="70" w:type="dxa"/>
-              <w:bottom w:w="40" w:type="dxa"/>
-              <w:right w:w="70" w:type="dxa"/>
-            </w:tcMar>
-            <w:vAlign w:val="center"/>
-          </w:tcPr>
-          <w:p>
-            <w:pPr>
-              <w:keepNext/>
-              <w:jc w:val="center"/>
-            </w:pPr>
-            <w:r>
-              <w:rPr>
-                <w:sz w:val="17"/>
-                <w:szCs w:val="17"/>
-              </w:rPr>
-              <w:t>0.7447</w:t>
-            </w:r>
-          </w:p>
-        </w:tc>
-        <w:tc>
-          <w:tcPr>
-            <w:tcW w:w="901" w:type="dxa"/>
-            <w:tcBorders>
-              <w:top w:val="single" w:sz="4" w:space="0" w:color="000000"/>
-              <w:left w:val="single" w:sz="4" w:space="0" w:color="000000"/>
-              <w:bottom w:val="single" w:sz="4" w:space="0" w:color="000000"/>
-              <w:right w:val="single" w:sz="4" w:space="0" w:color="000000"/>
-            </w:tcBorders>
-            <w:tcMar>
-              <w:top w:w="40" w:type="dxa"/>
-              <w:left w:w="70" w:type="dxa"/>
-              <w:bottom w:w="40" w:type="dxa"/>
-              <w:right w:w="70" w:type="dxa"/>
-            </w:tcMar>
-            <w:vAlign w:val="center"/>
-          </w:tcPr>
-          <w:p>
-            <w:pPr>
-              <w:keepNext/>
-              <w:jc w:val="center"/>
-            </w:pPr>
-            <w:r>
-              <w:rPr>
-                <w:sz w:val="17"/>
-                <w:szCs w:val="17"/>
-              </w:rPr>
-              <w:t>0.6952</w:t>
-            </w:r>
-          </w:p>
-        </w:tc>
-        <w:tc>
-          <w:tcPr>
-            <w:tcW w:w="901" w:type="dxa"/>
-            <w:tcBorders>
-              <w:top w:val="single" w:sz="4" w:space="0" w:color="000000"/>
-              <w:left w:val="single" w:sz="4" w:space="0" w:color="000000"/>
-              <w:bottom w:val="single" w:sz="4" w:space="0" w:color="000000"/>
-              <w:right w:val="single" w:sz="4" w:space="0" w:color="000000"/>
-            </w:tcBorders>
-            <w:tcMar>
-              <w:top w:w="40" w:type="dxa"/>
-              <w:left w:w="70" w:type="dxa"/>
-              <w:bottom w:w="40" w:type="dxa"/>
-              <w:right w:w="70" w:type="dxa"/>
-            </w:tcMar>
-            <w:vAlign w:val="center"/>
-          </w:tcPr>
-          <w:p>
-            <w:pPr>
-              <w:keepNext/>
-              <w:jc w:val="center"/>
-            </w:pPr>
-            <w:r>
-              <w:rPr>
-                <w:sz w:val="17"/>
-                <w:szCs w:val="17"/>
-              </w:rPr>
-              <w:t>0.7191</w:t>
-            </w:r>
-          </w:p>
-        </w:tc>
-        <w:tc>
-          <w:tcPr>
-            <w:tcW w:w="1001" w:type="dxa"/>
-            <w:tcBorders>
-              <w:top w:val="single" w:sz="4" w:space="0" w:color="000000"/>
-              <w:left w:val="single" w:sz="4" w:space="0" w:color="000000"/>
-              <w:bottom w:val="single" w:sz="4" w:space="0" w:color="000000"/>
-              <w:right w:val="single" w:sz="4" w:space="0" w:color="000000"/>
-            </w:tcBorders>
-            <w:tcMar>
-              <w:top w:w="40" w:type="dxa"/>
-              <w:left w:w="70" w:type="dxa"/>
-              <w:bottom w:w="40" w:type="dxa"/>
-              <w:right w:w="70" w:type="dxa"/>
-            </w:tcMar>
-            <w:vAlign w:val="center"/>
-          </w:tcPr>
-          <w:p>
-            <w:pPr>
-              <w:keepNext/>
-              <w:jc w:val="center"/>
-            </w:pPr>
-            <w:r>
-              <w:rPr>
-                <w:sz w:val="17"/>
-                <w:szCs w:val="17"/>
-              </w:rPr>
-              <w:t>0.7999</w:t>
-            </w:r>
-          </w:p>
-        </w:tc>
-        <w:tc>
-          <w:tcPr>
-            <w:tcW w:w="1251" w:type="dxa"/>
-            <w:gridSpan w:val="2"/>
-            <w:tcBorders>
-              <w:top w:val="single" w:sz="4" w:space="0" w:color="000000"/>
-              <w:left w:val="single" w:sz="4" w:space="0" w:color="000000"/>
-              <w:bottom w:val="single" w:sz="4" w:space="0" w:color="000000"/>
-              <w:right w:val="single" w:sz="4" w:space="0" w:color="000000"/>
-            </w:tcBorders>
-            <w:tcMar>
-              <w:top w:w="40" w:type="dxa"/>
-              <w:left w:w="70" w:type="dxa"/>
-              <w:bottom w:w="40" w:type="dxa"/>
-              <w:right w:w="70" w:type="dxa"/>
-            </w:tcMar>
-            <w:vAlign w:val="center"/>
-          </w:tcPr>
-          <w:p>
-            <w:pPr>
-              <w:keepNext/>
-              <w:jc w:val="center"/>
-            </w:pPr>
-            <w:r>
-              <w:rPr>
-                <w:sz w:val="17"/>
-                <w:szCs w:val="17"/>
-              </w:rPr>
-              <w:t>3.3</w:t>
             </w:r>
           </w:p>
         </w:tc>
@@ -11321,7 +10981,7 @@
         <w:jc w:val="both"/>
       </w:pPr>
       <w:r>
-        <w:t>The top four models are statistically tied. Their test accuracy ranges from 0.7313 to 0.7374. With 10,279 test patients the 95% margin of error is about 0.9 points, so a gap of 0.1 to 0.6 points does not show that one model is truly better.</w:t>
+        <w:t>The top three models are statistically tied. Their test accuracy ranges from 0.7347 to 0.7374. With 10,279 test patients the 95% margin of error is about 0.9 points, so a gap of up to 0.3 points does not show that one model is truly better.</w:t>
       </w:r>
     </w:p>
     <w:p>
@@ -11335,7 +10995,7 @@
         <w:jc w:val="both"/>
       </w:pPr>
       <w:r>
-        <w:t>Each model leads on a different metric. Random Forest has the highest accuracy (0.7374) and precision (0.7640), the MLP the highest recall (0.6952), and HistGradientBoosting the highest test ROC-AUC (0.8026) while training in 0.4 s. Gradient Boosting was chosen because it led on the validation set, not the test set.</w:t>
+        <w:t>Each model leads on a different metric. Random Forest has the highest accuracy (0.7374) and precision (0.7640), Gradient Boosting the highest recall (0.6909), and HistGradientBoosting the highest test ROC-AUC (0.8026) while training in 0.4 s. Gradient Boosting was chosen because it led on the validation set, not the test set.</w:t>
       </w:r>
     </w:p>
     <w:p>
@@ -11985,134 +11645,6 @@
                 <w:sz w:val="18"/>
                 <w:szCs w:val="18"/>
               </w:rPr>
-              <w:t>Neural Network (MLP)</w:t>
-            </w:r>
-          </w:p>
-        </w:tc>
-        <w:tc>
-          <w:tcPr>
-            <w:tcW w:w="2101" w:type="dxa"/>
-            <w:tcBorders>
-              <w:top w:val="single" w:sz="4" w:space="0" w:color="000000"/>
-              <w:left w:val="single" w:sz="4" w:space="0" w:color="000000"/>
-              <w:bottom w:val="single" w:sz="4" w:space="0" w:color="000000"/>
-              <w:right w:val="single" w:sz="4" w:space="0" w:color="000000"/>
-            </w:tcBorders>
-            <w:tcMar>
-              <w:top w:w="40" w:type="dxa"/>
-              <w:left w:w="70" w:type="dxa"/>
-              <w:bottom w:w="40" w:type="dxa"/>
-              <w:right w:w="70" w:type="dxa"/>
-            </w:tcMar>
-            <w:vAlign w:val="center"/>
-          </w:tcPr>
-          <w:p>
-            <w:pPr>
-              <w:keepNext/>
-              <w:jc w:val="center"/>
-            </w:pPr>
-            <w:r>
-              <w:rPr>
-                <w:sz w:val="18"/>
-                <w:szCs w:val="18"/>
-              </w:rPr>
-              <w:t>0.7343</w:t>
-            </w:r>
-          </w:p>
-        </w:tc>
-        <w:tc>
-          <w:tcPr>
-            <w:tcW w:w="2201" w:type="dxa"/>
-            <w:tcBorders>
-              <w:top w:val="single" w:sz="4" w:space="0" w:color="000000"/>
-              <w:left w:val="single" w:sz="4" w:space="0" w:color="000000"/>
-              <w:bottom w:val="single" w:sz="4" w:space="0" w:color="000000"/>
-              <w:right w:val="single" w:sz="4" w:space="0" w:color="000000"/>
-            </w:tcBorders>
-            <w:tcMar>
-              <w:top w:w="40" w:type="dxa"/>
-              <w:left w:w="70" w:type="dxa"/>
-              <w:bottom w:w="40" w:type="dxa"/>
-              <w:right w:w="70" w:type="dxa"/>
-            </w:tcMar>
-            <w:vAlign w:val="center"/>
-          </w:tcPr>
-          <w:p>
-            <w:pPr>
-              <w:keepNext/>
-              <w:jc w:val="center"/>
-            </w:pPr>
-            <w:r>
-              <w:rPr>
-                <w:sz w:val="18"/>
-                <w:szCs w:val="18"/>
-              </w:rPr>
-              <w:t>0.7329</w:t>
-            </w:r>
-          </w:p>
-        </w:tc>
-        <w:tc>
-          <w:tcPr>
-            <w:tcW w:w="2101" w:type="dxa"/>
-            <w:tcBorders>
-              <w:top w:val="single" w:sz="4" w:space="0" w:color="000000"/>
-              <w:left w:val="single" w:sz="4" w:space="0" w:color="000000"/>
-              <w:bottom w:val="single" w:sz="4" w:space="0" w:color="000000"/>
-              <w:right w:val="single" w:sz="4" w:space="0" w:color="000000"/>
-            </w:tcBorders>
-            <w:tcMar>
-              <w:top w:w="40" w:type="dxa"/>
-              <w:left w:w="70" w:type="dxa"/>
-              <w:bottom w:w="40" w:type="dxa"/>
-              <w:right w:w="70" w:type="dxa"/>
-            </w:tcMar>
-            <w:vAlign w:val="center"/>
-          </w:tcPr>
-          <w:p>
-            <w:pPr>
-              <w:keepNext/>
-              <w:jc w:val="center"/>
-            </w:pPr>
-            <w:r>
-              <w:rPr>
-                <w:sz w:val="18"/>
-                <w:szCs w:val="18"/>
-              </w:rPr>
-              <w:t>0.1</w:t>
-            </w:r>
-          </w:p>
-        </w:tc>
-      </w:tr>
-      <w:tr>
-        <w:trPr>
-          <w:cantSplit/>
-        </w:trPr>
-        <w:tc>
-          <w:tcPr>
-            <w:tcW w:w="2902" w:type="dxa"/>
-            <w:tcBorders>
-              <w:top w:val="single" w:sz="4" w:space="0" w:color="000000"/>
-              <w:left w:val="single" w:sz="4" w:space="0" w:color="000000"/>
-              <w:bottom w:val="single" w:sz="4" w:space="0" w:color="000000"/>
-              <w:right w:val="single" w:sz="4" w:space="0" w:color="000000"/>
-            </w:tcBorders>
-            <w:tcMar>
-              <w:top w:w="40" w:type="dxa"/>
-              <w:left w:w="70" w:type="dxa"/>
-              <w:bottom w:w="40" w:type="dxa"/>
-              <w:right w:w="70" w:type="dxa"/>
-            </w:tcMar>
-            <w:vAlign w:val="center"/>
-          </w:tcPr>
-          <w:p>
-            <w:pPr>
-              <w:keepNext/>
-            </w:pPr>
-            <w:r>
-              <w:rPr>
-                <w:sz w:val="18"/>
-                <w:szCs w:val="18"/>
-              </w:rPr>
               <w:t>Logistic Regression</w:t>
             </w:r>
           </w:p>
@@ -12623,7 +12155,7 @@
         <w:jc w:val="both"/>
       </w:pPr>
       <w:r>
-        <w:t>The selected Gradient Boosting model is served through a Streamlit web app (app/app.py) that takes eleven inputs and returns a risk probability in one click. Streamlit turns a Python script into a web page without HTML, CSS or JavaScript, so the model, the preprocessing and the interface live in one language and one repository. Because the page renders in the browser, the same app runs on Windows, macOS, Linux, Android and iOS without separate builds.</w:t>
+        <w:t>The selected Gradient Boosting model is served through a Streamlit web app (app/app.py) that takes eleven inputs and returns a risk probability in one click. Streamlit turns a Python script into a web page without HTML, CSS or JavaScript, so the model, the preprocessing and the interface live in one language and one repository. Because the page renders in a browser, the same code serves every screen size; the layout adapts to phone, tablet and desktop widths and was checked in browser emulation, not on physical devices.</w:t>
       </w:r>
     </w:p>
     <w:p>
@@ -13150,7 +12682,7 @@
         <w:jc w:val="both"/>
       </w:pPr>
       <w:r>
-        <w:t>The Predict tab collects age, gender, height, weight, systolic and diastolic pressure, cholesterol and glucose level (dropdowns) and smoking, alcohol and activity (checkboxes). Number inputs are limited to ranges close to those kept in cleaning, and BMI outside 12-60 is rejected. A disclaimer states that the app is for educational use only.</w:t>
+        <w:t>The Predict tab collects age, gender, height, weight, systolic and diastolic pressure, cholesterol and glucose level (dropdowns) and smoking, alcohol and activity (checkboxes). Number inputs are limited to ranges close to those kept in cleaning, and BMI outside 12-60 is rejected. An educational-use disclaimer banner is visible on every screen size. The layout is responsive: on phones (about 375 px wide) the metric cards form a 2 x 2 grid, the four tabs wrap onto two rows and the form and result stack; tablets and desktops show four cards in a row and a two-column form. Touch controls are at least 44 px high and no page scrolls sideways.</w:t>
       </w:r>
     </w:p>
     <w:p>
@@ -13238,7 +12770,7 @@
         <w:jc w:val="both"/>
       </w:pPr>
       <w:r>
-        <w:t>Table 13 shows three example patients scored by the saved model, one in each risk band. The values are real outputs of best_model.joblib (outputs/example_predictions.csv), and the same inputs can be typed into the app to reproduce them. Figures 8 and 9 show the Predict and Threshold analysis tabs.</w:t>
+        <w:t>Table 13 shows three example patients scored by the saved model, one in each risk band. The values are real outputs of best_model.joblib (outputs/example_predictions.csv), and the same inputs can be typed into the app to reproduce them. Figures 8 and 9 show the Predict tab in a desktop window and in tablet- and phone-sized windows (browser emulation).</w:t>
       </w:r>
     </w:p>
     <w:p>
@@ -13252,7 +12784,7 @@
           <w:sz w:val="20"/>
           <w:szCs w:val="20"/>
         </w:rPr>
-        <w:t>Table 13. Example predictions of the deployed model</w:t>
+        <w:t>Table 13. Example predictions of the saved model (local app)</w:t>
       </w:r>
     </w:p>
     <w:tbl>
@@ -13948,7 +13480,7 @@
       <w:tr>
         <w:trPr>
           <w:cantSplit/>
-          <w:trHeight w:hRule="exact" w:val="4300"/>
+          <w:trHeight w:hRule="exact" w:val="3575"/>
         </w:trPr>
         <w:tc>
           <w:tcPr>
@@ -13994,7 +13526,7 @@
             <w:r>
               <w:drawing>
                 <wp:inline xmlns:a="http://schemas.openxmlformats.org/drawingml/2006/main" xmlns:pic="http://schemas.openxmlformats.org/drawingml/2006/picture">
-                  <wp:extent cx="3000000" cy="2250000"/>
+                  <wp:extent cx="2562277" cy="1800000"/>
                   <wp:docPr id="2078794871" name="Picture 2078794871"/>
                   <wp:cNvGraphicFramePr>
                     <a:graphicFrameLocks noChangeAspect="1"/>
@@ -14015,7 +13547,7 @@
                         <pic:spPr>
                           <a:xfrm>
                             <a:off x="0" y="0"/>
-                            <a:ext cx="3000000" cy="2250000"/>
+                            <a:ext cx="2562277" cy="1800000"/>
                           </a:xfrm>
                           <a:prstGeom prst="rect"/>
                         </pic:spPr>
@@ -14034,7 +13566,7 @@
               <w:rPr>
                 <w:i w:val="0"/>
               </w:rPr>
-              <w:t>Figure 8. Predict tab</w:t>
+              <w:t>Figure 8. Desktop view (1024 px)</w:t>
             </w:r>
           </w:p>
         </w:tc>
@@ -14063,7 +13595,7 @@
             <w:r>
               <w:drawing>
                 <wp:inline xmlns:a="http://schemas.openxmlformats.org/drawingml/2006/main" xmlns:pic="http://schemas.openxmlformats.org/drawingml/2006/picture">
-                  <wp:extent cx="3000000" cy="2250000"/>
+                  <wp:extent cx="2080707" cy="1800000"/>
                   <wp:docPr id="2078794870" name="Picture 2078794870"/>
                   <wp:cNvGraphicFramePr>
                     <a:graphicFrameLocks noChangeAspect="1"/>
@@ -14084,7 +13616,7 @@
                         <pic:spPr>
                           <a:xfrm>
                             <a:off x="0" y="0"/>
-                            <a:ext cx="3000000" cy="2250000"/>
+                            <a:ext cx="2080707" cy="1800000"/>
                           </a:xfrm>
                           <a:prstGeom prst="rect"/>
                         </pic:spPr>
@@ -14100,7 +13632,7 @@
               <w:jc w:val="center"/>
             </w:pPr>
             <w:r>
-              <w:t>Figure 9. Threshold analysis tab</w:t>
+              <w:t>Figure 9. Tablet and phone views (emulated)</w:t>
             </w:r>
           </w:p>
         </w:tc>
@@ -14112,7 +13644,7 @@
         <w:keepNext/>
       </w:pPr>
       <w:r>
-        <w:t>7.3 Running locally and deployment</w:t>
+        <w:t>7.3 Running locally, same-Wi-Fi access and deployment</w:t>
       </w:r>
     </w:p>
     <w:p>
@@ -14121,7 +13653,25 @@
         <w:jc w:val="both"/>
       </w:pPr>
       <w:r>
-        <w:t>Local run: open the project folder in VS Code and run python run.py in the terminal. It installs the packages, cleans the data, trains the models and starts the app at http://localhost:8501. Cloud deployment (for example Streamlit Community Cloud) is possible but has not been performed for this project. Steps if you choose to deploy:</w:t>
+        <w:t>Local run: open the project folder in VS Code and run python run.py in the terminal. It installs the packages, cleans the data, trains the models and starts the app at http://localhost:8501.</w:t>
+      </w:r>
+    </w:p>
+    <w:p>
+      <w:pPr>
+        <w:spacing w:after="80" w:line="276" w:lineRule="auto"/>
+        <w:jc w:val="both"/>
+      </w:pPr>
+      <w:r>
+        <w:t>Same-Wi-Fi access from a phone (local network only): start the app with python -m streamlit run app/app.py --server.address 0.0.0.0, find the computer's IPv4 address (ipconfig on Windows), connect the phone to the same Wi-Fi and open http://&lt;computer-ip&gt;:8501. Some hotspots and guest networks block device-to-device traffic. The app has no login, so use it only on trusted networks. This was verified only up to the server answering on the computer's own network address, not from a physical phone.</w:t>
+      </w:r>
+    </w:p>
+    <w:p>
+      <w:pPr>
+        <w:spacing w:after="80" w:line="276" w:lineRule="auto"/>
+        <w:jc w:val="both"/>
+      </w:pPr>
+      <w:r>
+        <w:t>Public cloud deployment (not performed): the app is not online. It would need the repository on GitHub and a host such as Streamlit Community Cloud:</w:t>
       </w:r>
     </w:p>
     <w:p>
@@ -14177,7 +13727,7 @@
         <w:jc w:val="both"/>
       </w:pPr>
       <w:r>
-        <w:t>Click Deploy. Streamlit installs the packages from requirements.txt and publishes a public link.</w:t>
+        <w:t>Click Deploy. Streamlit installs requirements.txt (scikit-learn is pinned to 1.9.1; use Python 3.12 or newer) and publishes a public link.</w:t>
       </w:r>
     </w:p>
     <w:p>
@@ -14200,7 +13750,7 @@
         <w:jc w:val="both"/>
       </w:pPr>
       <w:r>
-        <w:t>Live app: [add deployed URL here]          GitHub repository: [add repository URL here]</w:t>
+        <w:t>Live app: [add deployed URL here]          GitHub repository: https://github.com/Anamom-exd/CardioSense-AI</w:t>
       </w:r>
     </w:p>
     <w:p>
@@ -14209,7 +13759,16 @@
         <w:keepNext/>
       </w:pPr>
       <w:r>
-        <w:t>7.4 Limitations of the interface</w:t>
+        <w:t>7.4 Testing and limitations of the interface</w:t>
+      </w:r>
+    </w:p>
+    <w:p>
+      <w:pPr>
+        <w:spacing w:after="80" w:line="276" w:lineRule="auto"/>
+        <w:jc w:val="both"/>
+      </w:pPr>
+      <w:r>
+        <w:t>What was tested: the layout was checked in desktop-browser emulation at 375 x 812 px (phone), 768 x 1024 px (tablet) and a 1024 px desktop window on all four tabs: no horizontal page overflow, controls at least 44 px high, text at least 12 px, and tables, charts and images within the screen width. Predictions for 12 test inputs (all three risk bands) were identical before and after the layout changes and equal to the saved model's output. Not tested: physical Android or iOS devices, other browsers, and access from another device over Wi-Fi.</w:t>
       </w:r>
     </w:p>
     <w:p>
@@ -14237,7 +13796,21 @@
         <w:jc w:val="both"/>
       </w:pPr>
       <w:r>
-        <w:t>The free hosting tier puts idle apps to sleep, so the first visit after a pause can take a few seconds.</w:t>
+        <w:t>Emulation does not replace testing on real phones, tablets and browsers; rendering may differ.</w:t>
+      </w:r>
+    </w:p>
+    <w:p>
+      <w:pPr>
+        <w:pStyle w:val="ListParagraph"/>
+        <w:numPr>
+          <w:ilvl w:val="0"/>
+          <w:numId w:val="2"/>
+        </w:numPr>
+        <w:spacing w:after="50" w:line="276" w:lineRule="auto"/>
+        <w:jc w:val="both"/>
+      </w:pPr>
+      <w:r>
+        <w:t>On a free hosting tier, idle apps may sleep, so the first visit after a pause can be slow.</w:t>
       </w:r>
     </w:p>
     <w:p>

</xml_diff>

<commit_message>
Add live Streamlit Cloud URL to README, report, slides and viva Q&A
- Replace the deployment placeholder with https://cardiosense-risk-predictor.streamlit.app/
- State that the live site was checked in browser emulation only; no physical-device test
- Rebuild report PDF from the updated DOCX (10 pages)

Co-Authored-By: Claude Sonnet 5.5 <noreply@anthropic.com>
</commit_message>
<xml_diff>
--- a/CardioSense_AI_Report.docx
+++ b/CardioSense_AI_Report.docx
@@ -108,7 +108,7 @@
         <w:jc w:val="both"/>
       </w:pPr>
       <w:r>
-        <w:t>This report builds and compares seven machine learning models that predict cardiovascular disease from eleven routine health measurements in the 70,000-record Kaggle Cardiovascular Disease dataset. Cleaning removed 1,477 duplicate or impossible records, and the remaining 68,523 were split 70/15/15 with stratification. Gradient Boosting, selected on validation ROC-AUC, reaches 73.7% test accuracy and a ROC-AUC of 0.802; the top three models differ by less than 0.3 points, and systolic blood pressure is the dominant feature. The best model is served through a responsive Streamlit web app (phone, tablet and desktop layouts) that runs locally and is not deployed publicly.</w:t>
+        <w:t>This report builds and compares seven machine learning models that predict cardiovascular disease from eleven routine health measurements in the 70,000-record Kaggle Cardiovascular Disease dataset. Cleaning removed 1,477 duplicate or impossible records, and the remaining 68,523 were split 70/15/15 with stratification. Gradient Boosting, selected on validation ROC-AUC, reaches 73.7% test accuracy and a ROC-AUC of 0.802; the top three models differ by less than 0.3 points, and systolic blood pressure is the dominant feature. The best model is served through a responsive Streamlit web app (phone, tablet and desktop layouts) that runs locally and is deployed on Streamlit Community Cloud (link in Section 7.3).</w:t>
       </w:r>
     </w:p>
     <w:p>
@@ -8664,7 +8664,7 @@
         <w:jc w:val="both"/>
       </w:pPr>
       <w:r>
-        <w:t>add SHAP explanations to the app, validate on an external dataset, and test on physical phones and tablets before any public deployment.</w:t>
+        <w:t>add SHAP explanations to the app, validate on an external dataset, and test the deployed app on physical phones and tablets.</w:t>
       </w:r>
     </w:p>
     <w:p>
@@ -13671,7 +13671,7 @@
         <w:jc w:val="both"/>
       </w:pPr>
       <w:r>
-        <w:t>Public cloud deployment (not performed): the app is not online. It would need the repository on GitHub and a host such as Streamlit Community Cloud:</w:t>
+        <w:t>Public cloud deployment: the app is deployed on Streamlit Community Cloud from the GitHub repository (main file app/app.py). Steps:</w:t>
       </w:r>
     </w:p>
     <w:p>
@@ -13741,16 +13741,16 @@
         <w:jc w:val="both"/>
       </w:pPr>
       <w:r>
-        <w:t>Open the link on a laptop and on a phone to confirm that it works on both.</w:t>
+        <w:t>Open the link on a laptop and a phone (only emulated checks so far; see 7.4).</w:t>
       </w:r>
     </w:p>
     <w:p>
       <w:pPr>
         <w:spacing w:before="50" w:after="80" w:line="276" w:lineRule="auto"/>
-        <w:jc w:val="both"/>
+        <w:jc w:val="left"/>
       </w:pPr>
       <w:r>
-        <w:t>Live app: [add deployed URL here]          GitHub repository: https://github.com/Anamom-exd/CardioSense-AI</w:t>
+        <w:t>Live app: https://cardiosense-risk-predictor.streamlit.app/   GitHub repository: https://github.com/Anamom-exd/CardioSense-AI</w:t>
       </w:r>
     </w:p>
     <w:p>
@@ -13768,7 +13768,7 @@
         <w:jc w:val="both"/>
       </w:pPr>
       <w:r>
-        <w:t>What was tested: the layout was checked in desktop-browser emulation at 375 x 812 px (phone), 768 x 1024 px (tablet) and a 1024 px desktop window on all four tabs: no horizontal page overflow, controls at least 44 px high, text at least 12 px, and tables, charts and images within the screen width. Predictions for 12 test inputs (all three risk bands) were identical before and after the layout changes and equal to the saved model's output. Not tested: physical Android or iOS devices, other browsers, and access from another device over Wi-Fi.</w:t>
+        <w:t>What was tested: the layout was checked in desktop-browser emulation at 375 x 812 px (phone), 768 x 1024 px (tablet) and a 1024 px desktop window on all four tabs: no horizontal page overflow, controls at least 44 px high, text at least 12 px, and tables, charts and images within the screen width. Predictions for 12 test inputs (all three risk bands) were identical before and after the layout changes and equal to the saved model's output. The live site was checked the same way (no overflow; 4 test inputs matched the local model); Streamlit Cloud's own badges can cover part of a phone screen. Not tested: physical Android or iOS devices, other browsers, and access from another device over Wi-Fi.</w:t>
       </w:r>
     </w:p>
     <w:p>

</xml_diff>

<commit_message>
Correct stale report statements found in review
- Reproducibility: remove leftover reference to the removed neural network
- Conclusion: state that the app is deployed on Streamlit Community Cloud
- Testing: body text 12 px, chart labels 11 px (report and README)
- Table 2: Kahraman dataset size is after cleaning
- Rebuild report PDF (10 pages)

Co-Authored-By: Claude Sonnet 5.5 <noreply@anthropic.com>
</commit_message>
<xml_diff>
--- a/CardioSense_AI_Report.docx
+++ b/CardioSense_AI_Report.docx
@@ -1926,7 +1926,7 @@
                 <w:sz w:val="16"/>
                 <w:szCs w:val="16"/>
               </w:rPr>
-              <w:t>Two merged Kaggle sets: 311,710 records</w:t>
+              <w:t>Two merged Kaggle sets: 311,710 records after cleaning</w:t>
             </w:r>
           </w:p>
         </w:tc>
@@ -3375,7 +3375,7 @@
         <w:jc w:val="both"/>
       </w:pPr>
       <w:r>
-        <w:t>Every random operation (the split, the forests, the network) uses random_state = 42, so reruns give the same numbers. The settings in Table 3 were chosen by hand and not tuned by grid search, so a tuned model might score slightly higher; the comparison is therefore between sensible, untuned configurations of each model family.</w:t>
+        <w:t>Every random operation (the split and the tree-based models) uses random_state = 42, so reruns give the same numbers. The settings in Table 3 were chosen by hand and not tuned by grid search, so a tuned model might score slightly higher; the comparison is therefore between sensible, untuned configurations of each model family.</w:t>
       </w:r>
     </w:p>
     <w:p>
@@ -8622,7 +8622,7 @@
         <w:jc w:val="both"/>
       </w:pPr>
       <w:r>
-        <w:t>Seven models were compared on a cleaned, stratified split of 68,523 records. Gradient Boosting, selected on validation ROC-AUC, reaches 73.7% test accuracy and a ROC-AUC of 0.802. The differences among the top three models are within the margin of error of the test set, so the choice of features and decision cutoff matters more than the choice of model. Blood pressure, age and cholesterol drive the predictions, and the model is served through a responsive web app that runs locally. Future work:</w:t>
+        <w:t>Seven models were compared on a cleaned, stratified split of 68,523 records. Gradient Boosting, selected on validation ROC-AUC, reaches 73.7% test accuracy and a ROC-AUC of 0.802. The differences among the top three models are within the margin of error of the test set, so the choice of features and decision cutoff matters more than the choice of model. Blood pressure, age and cholesterol drive the predictions, and the model is served through a responsive web app that runs locally and is deployed on Streamlit Community Cloud. Future work:</w:t>
       </w:r>
     </w:p>
     <w:p>
@@ -13768,7 +13768,7 @@
         <w:jc w:val="both"/>
       </w:pPr>
       <w:r>
-        <w:t>What was tested: the layout was checked in desktop-browser emulation at 375 x 812 px (phone), 768 x 1024 px (tablet) and a 1024 px desktop window on all four tabs: no horizontal page overflow, controls at least 44 px high, text at least 12 px, and tables, charts and images within the screen width. Predictions for 12 test inputs (all three risk bands) were identical before and after the layout changes and equal to the saved model's output. The live site was checked the same way (no overflow; 4 test inputs matched the local model); Streamlit Cloud's own badges can cover part of a phone screen. Not tested: physical Android or iOS devices, other browsers, and access from another device over Wi-Fi.</w:t>
+        <w:t>What was tested: the layout was checked in desktop-browser emulation at 375 x 812 px (phone), 768 x 1024 px (tablet) and a 1024 px desktop window on all four tabs: no horizontal page overflow, controls at least 44 px high, body text at least 12 px (chart labels 11 px), and tables, charts and images within the screen width. Predictions for 12 test inputs (all three risk bands) were identical before and after the layout changes and equal to the saved model's output. The live site was checked the same way (no overflow; 4 test inputs matched the local model); Streamlit Cloud's own badges can cover part of a phone screen. Not tested: physical Android or iOS devices, other browsers, and access from another device over Wi-Fi.</w:t>
       </w:r>
     </w:p>
     <w:p>

</xml_diff>